<commit_message>
Absorb AM Emerging Growth: rescored 87, resume updated; profile adds PowerPoint, Accelo global clients, proposals/SOWs
Co-Authored-By: Claude Opus 5.5 <noreply@anthropic.com>
Claude-Session: https://claude.ai/code/session_01HUxzaee8VTv7sJJkCcz6f3
</commit_message>
<xml_diff>
--- a/applications/absorb-account-manager-emerging-growth/Absorb-AccountManager-EmergingGrowth-Resume.docx
+++ b/applications/absorb-account-manager-emerging-growth/Absorb-AccountManager-EmergingGrowth-Resume.docx
@@ -177,7 +177,7 @@
           <w:i w:val="0"/>
           <w:color w:val="1A1A1A"/>
         </w:rPr>
-        <w:t>Expand retainer scope inside an existing client base, identifying, scoping, and proposing complementary services aligned to each client's objectives.</w:t>
+        <w:t>Expand retainer scope inside an existing client base, identifying complementary services and writing the proposals and statements of work to close them.</w:t>
       </w:r>
     </w:p>
     <w:p>
@@ -927,7 +927,7 @@
           <w:i w:val="0"/>
           <w:color w:val="1A1A1A"/>
         </w:rPr>
-        <w:t>Scoped CRM and project-management software for agencies and professional-services firms, building sequenced implementation plans for the implementation team to execute.</w:t>
+        <w:t>Wrote proposals and statements of work for agencies and professional-services firms across a global client base, building sequenced implementation plans for the implementation team to execute.</w:t>
       </w:r>
     </w:p>
     <w:p>
@@ -1094,7 +1094,7 @@
           <w:i w:val="0"/>
           <w:color w:val="1A1A1A"/>
         </w:rPr>
-        <w:t>Pipeline Management, Forecast Hygiene, Proposals &amp; Scoping, Negotiation, Value Positioning, Trusted Advisor Relationships</w:t>
+        <w:t>Pipeline Management, Forecast Hygiene, Proposals &amp; Statements of Work, Negotiation, Value Positioning, Global Client Base</w:t>
       </w:r>
     </w:p>
     <w:p>
@@ -1117,7 +1117,7 @@
           <w:i w:val="0"/>
           <w:color w:val="1A1A1A"/>
         </w:rPr>
-        <w:t>Salesforce, HubSpot, Gong, Zendesk (familiar), Excel, Slack, Notion</w:t>
+        <w:t>Salesforce, HubSpot, Gong, Zendesk (familiar), Excel, PowerPoint, Slack</w:t>
       </w:r>
     </w:p>
     <w:p>

</xml_diff>